<commit_message>
ori_occurred false if vacc_week > (nrow(data) + no_ori_delay), pct_workforce multiplied to caregive and patients workdays lost in add cea variable
</commit_message>
<xml_diff>
--- a/papers/Maintext_cholera_outbreak_modeling_28Oct2025.docx
+++ b/papers/Maintext_cholera_outbreak_modeling_28Oct2025.docx
@@ -571,19 +571,7 @@
         <w:rPr>
           <w:highlight w:val="yellow"/>
         </w:rPr>
-        <w:t xml:space="preserve"> [IQR: 41 </w:t>
-      </w:r>
-      <w:r>
-        <w:rPr>
-          <w:highlight w:val="yellow"/>
-        </w:rPr>
-        <w:t>–</w:t>
-      </w:r>
-      <w:r>
-        <w:rPr>
-          <w:highlight w:val="yellow"/>
-        </w:rPr>
-        <w:t xml:space="preserve"> 375</w:t>
+        <w:t xml:space="preserve"> [IQR: 41 – 375</w:t>
       </w:r>
       <w:r>
         <w:rPr>
@@ -1613,13 +1601,7 @@
         <w:rPr>
           <w:rFonts w:hint="eastAsia"/>
         </w:rPr>
-        <w:t xml:space="preserve"> of ORIs</w:t>
-      </w:r>
-      <w:r>
-        <w:rPr>
-          <w:rFonts w:hint="eastAsia"/>
-        </w:rPr>
-        <w:t>.</w:t>
+        <w:t xml:space="preserve"> of ORIs.</w:t>
       </w:r>
     </w:p>
     <w:p>
@@ -1700,13 +1682,7 @@
         <w:rPr>
           <w:rFonts w:hint="eastAsia"/>
         </w:rPr>
-        <w:t>per 1,000 doses</w:t>
-      </w:r>
-      <w:r>
-        <w:rPr>
-          <w:rFonts w:hint="eastAsia"/>
-        </w:rPr>
-        <w:t xml:space="preserve">. The values again can increase through shortening </w:t>
+        <w:t xml:space="preserve">per 1,000 doses. The values again can increase through shortening </w:t>
       </w:r>
       <w:r>
         <w:rPr>
@@ -14543,21 +14519,7 @@
           <w:rFonts w:hint="eastAsia"/>
           <w:highlight w:val="yellow"/>
         </w:rPr>
-        <w:t xml:space="preserve">. </w:t>
-      </w:r>
-      <w:r>
-        <w:rPr>
-          <w:rFonts w:hint="eastAsia"/>
-          <w:highlight w:val="yellow"/>
-        </w:rPr>
-        <w:t>As expected in increased OCV efficiency under high AR prioritized targeting,</w:t>
-      </w:r>
-      <w:r>
-        <w:rPr>
-          <w:rFonts w:hint="eastAsia"/>
-          <w:highlight w:val="yellow"/>
-        </w:rPr>
-        <w:t xml:space="preserve"> the cost per case averted </w:t>
+        <w:t xml:space="preserve">. As expected in increased OCV efficiency under high AR prioritized targeting, the cost per case averted </w:t>
       </w:r>
       <w:proofErr w:type="gramStart"/>
       <w:r>
@@ -14565,14 +14527,7 @@
           <w:rFonts w:hint="eastAsia"/>
           <w:highlight w:val="yellow"/>
         </w:rPr>
-        <w:t xml:space="preserve">was </w:t>
-      </w:r>
-      <w:r>
-        <w:rPr>
-          <w:rFonts w:hint="eastAsia"/>
-          <w:highlight w:val="yellow"/>
-        </w:rPr>
-        <w:t xml:space="preserve"> </w:t>
+        <w:t xml:space="preserve">was  </w:t>
       </w:r>
       <w:r>
         <w:t>41</w:t>
@@ -14594,10 +14549,7 @@
         <w:t xml:space="preserve"> [IQR:</w:t>
       </w:r>
       <w:r>
-        <w:t xml:space="preserve"> </w:t>
-      </w:r>
-      <w:r>
-        <w:t xml:space="preserve">-17 </w:t>
+        <w:t xml:space="preserve"> -17 </w:t>
       </w:r>
       <w:r>
         <w:rPr>
@@ -15030,14 +14982,7 @@
           <w:rFonts w:hint="eastAsia"/>
           <w:highlight w:val="yellow"/>
         </w:rPr>
-        <w:t xml:space="preserve"> </w:t>
-      </w:r>
-      <w:r>
-        <w:rPr>
-          <w:rFonts w:hint="eastAsia"/>
-          <w:highlight w:val="yellow"/>
-        </w:rPr>
-        <w:t xml:space="preserve">OCV efficiency and cost effectiveness were </w:t>
+        <w:t xml:space="preserve"> OCV efficiency and cost effectiveness were </w:t>
       </w:r>
       <w:r>
         <w:rPr>
@@ -15065,21 +15010,7 @@
           <w:rFonts w:hint="eastAsia"/>
           <w:highlight w:val="yellow"/>
         </w:rPr>
-        <w:t xml:space="preserve">Focusing on outbreaks of top </w:t>
-      </w:r>
-      <w:r>
-        <w:rPr>
-          <w:rFonts w:hint="eastAsia"/>
-          <w:highlight w:val="yellow"/>
-        </w:rPr>
-        <w:t>quartile</w:t>
-      </w:r>
-      <w:r>
-        <w:rPr>
-          <w:rFonts w:hint="eastAsia"/>
-          <w:highlight w:val="yellow"/>
-        </w:rPr>
-        <w:t xml:space="preserve"> of </w:t>
+        <w:t xml:space="preserve">Focusing on outbreaks of top quartile of </w:t>
       </w:r>
       <w:r>
         <w:rPr>
@@ -19013,7 +18944,7 @@
         <w:fldChar w:fldCharType="end"/>
       </w:r>
       <w:r>
-        <w:t xml:space="preserve"> or geographic targeting.</w:t>
+        <w:t xml:space="preserve"> or geographic targeting</w:t>
       </w:r>
       <w:r>
         <w:fldChar w:fldCharType="begin"/>
@@ -19035,22 +18966,110 @@
         <w:fldChar w:fldCharType="end"/>
       </w:r>
       <w:r>
+        <w:rPr>
+          <w:rFonts w:hint="eastAsia"/>
+        </w:rPr>
+        <w:t xml:space="preserve"> if lower-level, </w:t>
+      </w:r>
+      <w:r>
+        <w:rPr>
+          <w:rFonts w:hint="eastAsia"/>
+          <w:highlight w:val="yellow"/>
+        </w:rPr>
+        <w:t>high-risk</w:t>
+      </w:r>
+      <w:r>
+        <w:rPr>
+          <w:rFonts w:hint="eastAsia"/>
+          <w:highlight w:val="yellow"/>
+        </w:rPr>
+        <w:t xml:space="preserve"> </w:t>
+      </w:r>
+      <w:r>
+        <w:rPr>
+          <w:rFonts w:hint="eastAsia"/>
+          <w:highlight w:val="yellow"/>
+        </w:rPr>
+        <w:t xml:space="preserve">administrative units </w:t>
+      </w:r>
+      <w:r>
+        <w:rPr>
+          <w:rFonts w:hint="eastAsia"/>
+          <w:highlight w:val="yellow"/>
+        </w:rPr>
+        <w:t xml:space="preserve">are targeted </w:t>
+      </w:r>
+      <w:r>
+        <w:rPr>
+          <w:rFonts w:hint="eastAsia"/>
+          <w:highlight w:val="yellow"/>
+        </w:rPr>
+        <w:t>than our model</w:t>
+      </w:r>
+      <w:r>
+        <w:rPr>
+          <w:rFonts w:hint="eastAsia"/>
+          <w:highlight w:val="yellow"/>
+        </w:rPr>
+        <w:t xml:space="preserve"> assumed </w:t>
+      </w:r>
+      <w:proofErr w:type="spellStart"/>
+      <w:r>
+        <w:rPr>
+          <w:rFonts w:hint="eastAsia"/>
+          <w:highlight w:val="yellow"/>
+        </w:rPr>
+        <w:t>tion</w:t>
+      </w:r>
+      <w:proofErr w:type="spellEnd"/>
+      <w:r>
+        <w:rPr>
+          <w:rFonts w:hint="eastAsia"/>
+          <w:highlight w:val="yellow"/>
+        </w:rPr>
+        <w:t xml:space="preserve"> of targeting all people of the </w:t>
+      </w:r>
+      <w:r>
+        <w:rPr>
+          <w:highlight w:val="yellow"/>
+        </w:rPr>
+        <w:t>“</w:t>
+      </w:r>
+      <w:r>
+        <w:rPr>
+          <w:rFonts w:hint="eastAsia"/>
+          <w:highlight w:val="yellow"/>
+        </w:rPr>
+        <w:t>outbreaks-affected</w:t>
+      </w:r>
+      <w:r>
+        <w:rPr>
+          <w:highlight w:val="yellow"/>
+        </w:rPr>
+        <w:t>”</w:t>
+      </w:r>
+      <w:r>
+        <w:rPr>
+          <w:rFonts w:hint="eastAsia"/>
+          <w:highlight w:val="yellow"/>
+        </w:rPr>
+        <w:t xml:space="preserve"> administrative unit</w:t>
+      </w:r>
+      <w:r>
+        <w:rPr>
+          <w:rFonts w:hint="eastAsia"/>
+        </w:rPr>
+        <w:t xml:space="preserve">. </w:t>
+      </w:r>
+      <w:r>
+        <w:rPr>
+          <w:rFonts w:hint="eastAsia"/>
+        </w:rPr>
+        <w:lastRenderedPageBreak/>
+        <w:t>population.</w:t>
+      </w:r>
+      <w:r>
         <w:t xml:space="preserve"> Conversely, vaccine wastage</w:t>
-      </w:r>
-      <w:r>
-        <w:t>—</w:t>
-      </w:r>
-      <w:r>
-        <w:rPr>
-          <w:rFonts w:hint="eastAsia"/>
-        </w:rPr>
-        <w:t xml:space="preserve">documented in </w:t>
-      </w:r>
-      <w:r>
-        <w:rPr>
-          <w:rFonts w:hint="eastAsia"/>
-        </w:rPr>
-        <w:t>coverage reports</w:t>
       </w:r>
       <w:r>
         <w:fldChar w:fldCharType="begin"/>
@@ -19072,7 +19091,10 @@
         <w:fldChar w:fldCharType="end"/>
       </w:r>
       <w:r>
-        <w:t>—</w:t>
+        <w:rPr>
+          <w:rFonts w:hint="eastAsia"/>
+        </w:rPr>
+        <w:t xml:space="preserve"> </w:t>
       </w:r>
       <w:r>
         <w:t xml:space="preserve">could </w:t>
@@ -19090,13 +19112,13 @@
         <w:t xml:space="preserve">s of </w:t>
       </w:r>
       <w:r>
-        <w:t>cases</w:t>
-      </w:r>
-      <w:r>
-        <w:t>, deaths, and DALYs</w:t>
-      </w:r>
-      <w:r>
-        <w:t xml:space="preserve"> averted per 1,000 doses.</w:t>
+        <w:rPr>
+          <w:rFonts w:hint="eastAsia"/>
+        </w:rPr>
+        <w:t>ORI efficiency and cost effectiveness</w:t>
+      </w:r>
+      <w:r>
+        <w:t>.</w:t>
       </w:r>
       <w:r>
         <w:t xml:space="preserve"> </w:t>
@@ -19111,7 +19133,6 @@
         <w:rPr>
           <w:rFonts w:hint="eastAsia"/>
         </w:rPr>
-        <w:lastRenderedPageBreak/>
         <w:t>parameter</w:t>
       </w:r>
       <w:r>
@@ -19657,7 +19678,30 @@
       </w:r>
       <w:proofErr w:type="gramEnd"/>
       <w:r>
-        <w:t>, if the outbreak had ended before the ORI was initiated. However, in real-world settings, it is often difficult to determine in real time whether an outbreak has concluded. Under this alternative scenario, the estimated impact of ORIs declined more sharply</w:t>
+        <w:t xml:space="preserve">, if the outbreak had ended </w:t>
+      </w:r>
+      <w:r>
+        <w:rPr>
+          <w:rFonts w:hint="eastAsia"/>
+        </w:rPr>
+        <w:t xml:space="preserve">two weeks </w:t>
+      </w:r>
+      <w:r>
+        <w:t xml:space="preserve">before the ORI was initiated. However, in real-world settings, it is often difficult to determine in real time whether an outbreak has </w:t>
+      </w:r>
+      <w:proofErr w:type="gramStart"/>
+      <w:r>
+        <w:t>concluded</w:t>
+      </w:r>
+      <w:proofErr w:type="gramEnd"/>
+      <w:r>
+        <w:rPr>
+          <w:rFonts w:hint="eastAsia"/>
+        </w:rPr>
+        <w:t xml:space="preserve"> and ORIs may be conducted anyways</w:t>
+      </w:r>
+      <w:r>
+        <w:t>. Under this alternative scenario, the estimated impact of ORIs declined more sharply</w:t>
       </w:r>
       <w:r>
         <w:rPr>
@@ -19675,49 +19719,81 @@
         <w:t>3</w:t>
       </w:r>
       <w:r>
-        <w:t>% in the main scenario to 2.7% in the alternative.</w:t>
-      </w:r>
-      <w:r>
-        <w:rPr>
-          <w:rFonts w:hint="eastAsia"/>
-        </w:rPr>
-        <w:t xml:space="preserve"> </w:t>
-      </w:r>
-      <w:r>
-        <w:rPr>
-          <w:rFonts w:hint="eastAsia"/>
-        </w:rPr>
-        <w:t xml:space="preserve">Finally, </w:t>
-      </w:r>
-      <w:r>
-        <w:t xml:space="preserve">our estimates are contingent on the outbreak dataset used, which is based on a specific outbreak definition that is not universally accepted and may vary by context. Applying alternative outbreak criteria could yield different datasets and, consequently, different estimates of vaccine impact. </w:t>
-      </w:r>
-      <w:r>
-        <w:rPr>
-          <w:rFonts w:hint="eastAsia"/>
-        </w:rPr>
-        <w:t>T</w:t>
-      </w:r>
-      <w:r>
-        <w:t xml:space="preserve">he main analysis excluded outbreaks that were either too small or too large, based on the population sizes commonly observed in historical OCV campaigns. While this filtering was appropriate for retrospective evaluation, such thresholds may not be applicable to future scenarios. To explore a broader range of </w:t>
-      </w:r>
-      <w:r>
-        <w:lastRenderedPageBreak/>
-        <w:t>outbreak settings, we relaxed these criteria and included outbreaks occurring in populations between 5,000 and 15,000,000, instead of the original range of 16,500 to 5,000,000. Under this more inclusive scenario, the median and interquartile ranges remained largely unchanged (</w:t>
-      </w:r>
-      <w:r>
-        <w:rPr>
+        <w:t>% in the main scenario to 2.7% in the alternative</w:t>
+      </w:r>
+      <w:r>
+        <w:rPr>
+          <w:rFonts w:hint="eastAsia"/>
+        </w:rPr>
+        <w:t xml:space="preserve"> </w:t>
+      </w:r>
+      <w:r>
+        <w:t>(</w:t>
+      </w:r>
+      <w:r>
+        <w:rPr>
+          <w:rFonts w:hint="eastAsia"/>
+        </w:rPr>
+        <w:t xml:space="preserve">Supplementary Material </w:t>
+      </w:r>
+      <w:r>
+        <w:rPr>
+          <w:rFonts w:hint="eastAsia"/>
           <w:b/>
           <w:bCs/>
         </w:rPr>
-        <w:t>Table S</w:t>
-      </w:r>
-      <w:r>
-        <w:rPr>
-          <w:rFonts w:hint="eastAsia"/>
+        <w:t>Table SX</w:t>
+      </w:r>
+      <w:r>
+        <w:t>)</w:t>
+      </w:r>
+      <w:r>
+        <w:rPr>
+          <w:rFonts w:hint="eastAsia"/>
+        </w:rPr>
+        <w:t xml:space="preserve"> </w:t>
+      </w:r>
+      <w:r>
+        <w:rPr>
+          <w:rFonts w:hint="eastAsia"/>
+        </w:rPr>
+        <w:t>Sixth</w:t>
+      </w:r>
+      <w:r>
+        <w:rPr>
+          <w:rFonts w:hint="eastAsia"/>
+        </w:rPr>
+        <w:t xml:space="preserve">, </w:t>
+      </w:r>
+      <w:r>
+        <w:t xml:space="preserve">our estimates are contingent on the outbreak dataset used, which is based on a specific outbreak definition that is not universally accepted and may vary by context. Applying alternative outbreak criteria could yield different datasets and, consequently, different estimates of vaccine impact. </w:t>
+      </w:r>
+      <w:r>
+        <w:rPr>
+          <w:rFonts w:hint="eastAsia"/>
+        </w:rPr>
+        <w:t>T</w:t>
+      </w:r>
+      <w:r>
+        <w:t xml:space="preserve">he main analysis excluded outbreaks that were either too small or too large, based on the population sizes commonly observed in historical </w:t>
+      </w:r>
+      <w:r>
+        <w:lastRenderedPageBreak/>
+        <w:t>OCV campaigns. While this filtering was appropriate for retrospective evaluation, such thresholds may not be applicable to future scenarios. To explore a broader range of outbreak settings, we relaxed these criteria and included outbreaks occurring in populations between 5,000 and 15,000,000, instead of the original range of 16,500 to 5,000,000. Under this more inclusive scenario, the median and interquartile ranges remained largely unchanged (</w:t>
+      </w:r>
+      <w:r>
+        <w:rPr>
           <w:b/>
           <w:bCs/>
         </w:rPr>
+        <w:t>Table S</w:t>
+      </w:r>
+      <w:r>
+        <w:rPr>
+          <w:rFonts w:hint="eastAsia"/>
+          <w:b/>
+          <w:bCs/>
+        </w:rPr>
         <w:t>4</w:t>
       </w:r>
       <w:r>
@@ -19728,36 +19804,116 @@
           <w:rFonts w:hint="eastAsia"/>
         </w:rPr>
         <w:t xml:space="preserve">  </w:t>
+      </w:r>
+      <w:r>
+        <w:rPr>
+          <w:rFonts w:hint="eastAsia"/>
+        </w:rPr>
+        <w:t xml:space="preserve">Finally (or </w:t>
+      </w:r>
+      <w:proofErr w:type="gramStart"/>
+      <w:r>
+        <w:rPr>
+          <w:rFonts w:hint="eastAsia"/>
+        </w:rPr>
+        <w:t>Seventh</w:t>
+      </w:r>
+      <w:proofErr w:type="gramEnd"/>
+      <w:r>
+        <w:rPr>
+          <w:rFonts w:hint="eastAsia"/>
+        </w:rPr>
+        <w:t xml:space="preserve">), the overall impact, efficiency, and cost effectiveness derived from our simulation of OCV deployment from stockpile requires careful interpretation. Our simulation </w:t>
+      </w:r>
+      <w:r>
+        <w:rPr>
+          <w:rFonts w:hint="eastAsia"/>
+        </w:rPr>
+        <w:t>ignores many potentially important realistic details to produce accurate estimation of the overall impact of OCV deployment from global stockpile. That is, our simulation does not account for, for example, critical ch</w:t>
+      </w:r>
+      <w:r>
+        <w:rPr>
+          <w:rFonts w:hint="eastAsia"/>
+        </w:rPr>
+        <w:t>a</w:t>
+      </w:r>
+      <w:r>
+        <w:rPr>
+          <w:rFonts w:hint="eastAsia"/>
+        </w:rPr>
+        <w:t>ra</w:t>
+      </w:r>
+      <w:r>
+        <w:rPr>
+          <w:rFonts w:hint="eastAsia"/>
+        </w:rPr>
+        <w:t xml:space="preserve">cteristics of actual outbreaks targeted, vaccine coverage levels, </w:t>
+      </w:r>
+      <w:r>
+        <w:rPr>
+          <w:rFonts w:hint="eastAsia"/>
+        </w:rPr>
+        <w:t>detailed distribution of delays in ORI implementation. Our simulation of overall simulation was intended</w:t>
+      </w:r>
+      <w:r>
+        <w:rPr>
+          <w:rFonts w:hint="eastAsia"/>
+        </w:rPr>
+        <w:t xml:space="preserve"> to illustrate the disproportionate contribution of larger and longer outbreaks to the overall impact and prioritization</w:t>
+      </w:r>
+      <w:r>
+        <w:rPr>
+          <w:rFonts w:hint="eastAsia"/>
+        </w:rPr>
+        <w:t>, which eventually will increase the median impact we can expect as we continue to vaccinate the outbreak-affected population even with delays.</w:t>
+      </w:r>
+      <w:r>
+        <w:rPr>
+          <w:rFonts w:hint="eastAsia"/>
+        </w:rPr>
+        <w:t xml:space="preserve"> </w:t>
+      </w:r>
+    </w:p>
+    <w:p>
+      <w:pPr>
+        <w:pStyle w:val="Heading2"/>
+      </w:pPr>
+      <w:bookmarkStart w:id="32" w:name="_Toc184909210"/>
+      <w:r>
+        <w:t>Conclusion</w:t>
+      </w:r>
+      <w:bookmarkEnd w:id="32"/>
+    </w:p>
+    <w:p>
+      <w:r>
+        <w:t>This study provides important insights into the effectiveness of outbreak response immunizations (ORIs) across a broad range of cholera outbreak scenarios in sub-Saharan Africa. Our findings underscore the critical importance of timely intervention and strategic outbreak prioritization to maximize vaccine impact. Looking ahead, advances in predictive modeling, the integration of real-time surveillance data, and the development of more flexible and targeted vaccine deployment strategies will be essential</w:t>
+      </w:r>
+      <w:r>
+        <w:rPr>
+          <w:rFonts w:hint="eastAsia"/>
+        </w:rPr>
+        <w:t xml:space="preserve"> to</w:t>
+      </w:r>
+      <w:r>
+        <w:t xml:space="preserve"> contribute meaningfully to global cholera control and elimination efforts.</w:t>
       </w:r>
     </w:p>
     <w:p/>
     <w:p>
-      <w:r>
-        <w:rPr>
-          <w:rFonts w:hint="eastAsia"/>
-        </w:rPr>
-        <w:t>Our estimates for cumulative impact of OCV</w:t>
-      </w:r>
-      <w:r>
-        <w:rPr>
-          <w:rFonts w:hint="eastAsia"/>
-        </w:rPr>
-        <w:t xml:space="preserve">s that were administered across multiple outbreaks was to illustrate the disproportionate contribution of larger and longer outbreaks to the overall impact and prioritization. </w:t>
+      <w:pPr>
+        <w:pStyle w:val="Heading2"/>
+      </w:pPr>
+      <w:r>
+        <w:rPr>
+          <w:rFonts w:hint="eastAsia"/>
+        </w:rPr>
+        <w:lastRenderedPageBreak/>
+        <w:t>Acknowledgement</w:t>
       </w:r>
     </w:p>
     <w:p>
-      <w:pPr>
-        <w:pStyle w:val="Heading2"/>
-      </w:pPr>
-      <w:bookmarkStart w:id="32" w:name="_Toc184909210"/>
-      <w:r>
-        <w:t>Conclusion</w:t>
-      </w:r>
-      <w:bookmarkEnd w:id="32"/>
-    </w:p>
-    <w:p>
-      <w:r>
-        <w:t>This study provides important insights into the effectiveness of outbreak response immunizations (ORIs) across a broad range of cholera outbreak scenarios in sub-Saharan Africa. Our findings underscore the critical importance of timely intervention and strategic outbreak prioritization to maximize vaccine impact. Looking ahead, advances in predictive modeling, the integration of real-time surveillance data, and the development of more flexible and targeted vaccine deployment strategies will be essential. These improvements can support more efficient, data-driven outbreak responses and contribute meaningfully to global cholera control and elimination efforts.</w:t>
+      <w:r>
+        <w:t>This work was supported, in whole or in part, by the Bill &amp; Melinda Gates Foundation [INV-009125]. The conclusions and opinions expressed in this work are those of the authors alone and shall not be attributed to the Foundation. Under the grant conditions of the Foundation, a Creative Commons Attribution 4.0 License has already been assigned to the Author Accepted Manuscript version that might arise from this submission. Please note works submitted as a preprint have not undergone a peer review process.</w:t>
       </w:r>
     </w:p>
     <w:p/>
@@ -19769,24 +19925,6 @@
         <w:rPr>
           <w:rFonts w:hint="eastAsia"/>
         </w:rPr>
-        <w:t>Acknowledgement</w:t>
-      </w:r>
-    </w:p>
-    <w:p>
-      <w:r>
-        <w:t>This work was supported, in whole or in part, by the Bill &amp; Melinda Gates Foundation [INV-009125]. The conclusions and opinions expressed in this work are those of the authors alone and shall not be attributed to the Foundation. Under the grant conditions of the Foundation, a Creative Commons Attribution 4.0 License has already been assigned to the Author Accepted Manuscript version that might arise from this submission. Please note works submitted as a preprint have not undergone a peer review process.</w:t>
-      </w:r>
-    </w:p>
-    <w:p/>
-    <w:p>
-      <w:pPr>
-        <w:pStyle w:val="Heading2"/>
-      </w:pPr>
-      <w:r>
-        <w:rPr>
-          <w:rFonts w:hint="eastAsia"/>
-        </w:rPr>
-        <w:lastRenderedPageBreak/>
         <w:t xml:space="preserve">Author contributions </w:t>
       </w:r>
     </w:p>
@@ -20035,7 +20173,11 @@
       </w:r>
       <w:r>
         <w:tab/>
-        <w:t xml:space="preserve">Khan AI, Levin A, Chao DL, DeRoeck D, Dimitrov DT, Khan JAM, et al. The impact and cost-effectiveness of controlling cholera through the use of oral cholera vaccines in urban Bangladesh: A disease modeling and economic analysis. Maheu-Giroux M, editor. PLoS Negl Trop Dis. 2018 Oct 9;12(10):e0006652. </w:t>
+        <w:t xml:space="preserve">Khan AI, Levin A, Chao DL, DeRoeck D, Dimitrov DT, Khan JAM, et al. The impact and cost-effectiveness of controlling cholera through the use of oral cholera vaccines in </w:t>
+      </w:r>
+      <w:r>
+        <w:lastRenderedPageBreak/>
+        <w:t xml:space="preserve">urban Bangladesh: A disease modeling and economic analysis. Maheu-Giroux M, editor. PLoS Negl Trop Dis. 2018 Oct 9;12(10):e0006652. </w:t>
       </w:r>
     </w:p>
     <w:p>
@@ -20079,7 +20221,6 @@
         <w:pStyle w:val="Bibliography"/>
       </w:pPr>
       <w:r>
-        <w:lastRenderedPageBreak/>
         <w:t xml:space="preserve">8. </w:t>
       </w:r>
       <w:r>
@@ -20179,6 +20320,7 @@
         </w:rPr>
       </w:pPr>
       <w:r>
+        <w:lastRenderedPageBreak/>
         <w:t xml:space="preserve">16. </w:t>
       </w:r>
       <w:r>
@@ -20242,7 +20384,6 @@
         <w:pStyle w:val="Bibliography"/>
       </w:pPr>
       <w:r>
-        <w:lastRenderedPageBreak/>
         <w:t xml:space="preserve">20. </w:t>
       </w:r>
       <w:r>
@@ -20351,6 +20492,7 @@
         <w:pStyle w:val="Bibliography"/>
       </w:pPr>
       <w:r>
+        <w:lastRenderedPageBreak/>
         <w:t xml:space="preserve">29. </w:t>
       </w:r>
       <w:r>
@@ -20399,7 +20541,6 @@
         <w:pStyle w:val="Bibliography"/>
       </w:pPr>
       <w:r>
-        <w:lastRenderedPageBreak/>
         <w:t xml:space="preserve">33. </w:t>
       </w:r>
       <w:r>
@@ -20535,6 +20676,7 @@
         <w:pStyle w:val="Bibliography"/>
       </w:pPr>
       <w:r>
+        <w:lastRenderedPageBreak/>
         <w:t xml:space="preserve">42. </w:t>
       </w:r>
       <w:r>
@@ -20571,7 +20713,6 @@
         <w:pStyle w:val="Bibliography"/>
       </w:pPr>
       <w:r>
-        <w:lastRenderedPageBreak/>
         <w:t xml:space="preserve">45. </w:t>
       </w:r>
       <w:r>
@@ -20656,6 +20797,7 @@
         <w:pStyle w:val="Bibliography"/>
       </w:pPr>
       <w:r>
+        <w:lastRenderedPageBreak/>
         <w:t xml:space="preserve">52. </w:t>
       </w:r>
       <w:r>
@@ -20707,7 +20849,6 @@
         <w:pStyle w:val="Bibliography"/>
       </w:pPr>
       <w:r>
-        <w:lastRenderedPageBreak/>
         <w:t xml:space="preserve">56. </w:t>
       </w:r>
       <w:r>
@@ -20810,6 +20951,7 @@
         <w:pStyle w:val="Bibliography"/>
       </w:pPr>
       <w:r>
+        <w:lastRenderedPageBreak/>
         <w:t xml:space="preserve">63. </w:t>
       </w:r>
       <w:r>
@@ -20873,7 +21015,6 @@
         <w:rPr>
           <w:lang w:val="de-DE"/>
         </w:rPr>
-        <w:lastRenderedPageBreak/>
         <w:t xml:space="preserve">68. </w:t>
       </w:r>
       <w:r>
@@ -20967,6 +21108,7 @@
         </w:rPr>
       </w:pPr>
       <w:r>
+        <w:lastRenderedPageBreak/>
         <w:t xml:space="preserve">75. </w:t>
       </w:r>
       <w:r>
@@ -21030,7 +21172,6 @@
         <w:pStyle w:val="Bibliography"/>
       </w:pPr>
       <w:r>
-        <w:lastRenderedPageBreak/>
         <w:t xml:space="preserve">79. </w:t>
       </w:r>
       <w:r>
@@ -21169,6 +21310,7 @@
         <w:pStyle w:val="Bibliography"/>
       </w:pPr>
       <w:r>
+        <w:lastRenderedPageBreak/>
         <w:t xml:space="preserve">86. </w:t>
       </w:r>
       <w:r>
@@ -24387,27 +24529,12 @@
 </file>
 
 <file path=customXml/item1.xml><?xml version="1.0" encoding="utf-8"?>
-<p:properties xmlns:p="http://schemas.microsoft.com/office/2006/metadata/properties" xmlns:xsi="http://www.w3.org/2001/XMLSchema-instance" xmlns:pc="http://schemas.microsoft.com/office/infopath/2007/PartnerControls">
-  <documentManagement>
-    <_activity xmlns="00f5eb7a-3f09-4ccb-9a17-2c4fa8202c3e" xsi:nil="true"/>
-  </documentManagement>
-</p:properties>
+<go:gDocsCustomXmlDataStorage xmlns:go="http://customooxmlschemas.google.com/" xmlns:r="http://schemas.openxmlformats.org/officeDocument/2006/relationships" uri="GoogleDocsCustomDataVersion2">
+  <go:docsCustomData xmlns:go="http://customooxmlschemas.google.com/" roundtripDataSignature="AMtx7mgdndu53wYGt6HnkXDpKDmMCu/43A==">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</go:docsCustomData>
+</go:gDocsCustomXmlDataStorage>
 </file>
 
 <file path=customXml/item2.xml><?xml version="1.0" encoding="utf-8"?>
-<?mso-contentType ?>
-<FormTemplates xmlns="http://schemas.microsoft.com/sharepoint/v3/contenttype/forms">
-  <Display>DocumentLibraryForm</Display>
-  <Edit>DocumentLibraryForm</Edit>
-  <New>DocumentLibraryForm</New>
-</FormTemplates>
-</file>
-
-<file path=customXml/item3.xml><?xml version="1.0" encoding="utf-8"?>
-<b:Sources xmlns:b="http://schemas.openxmlformats.org/officeDocument/2006/bibliography" xmlns="http://schemas.openxmlformats.org/officeDocument/2006/bibliography" SelectedStyle="\APASixthEditionOfficeOnline.xsl" StyleName="APA" Version="6"/>
-</file>
-
-<file path=customXml/item4.xml><?xml version="1.0" encoding="utf-8"?>
 <ct:contentTypeSchema xmlns:ct="http://schemas.microsoft.com/office/2006/metadata/contentType" xmlns:ma="http://schemas.microsoft.com/office/2006/metadata/properties/metaAttributes" ct:_="" ma:_="" ma:contentTypeName="Document" ma:contentTypeID="0x010100A2E3680EE573554D94035A4421814AE7" ma:contentTypeVersion="17" ma:contentTypeDescription="Create a new document." ma:contentTypeScope="" ma:versionID="677f1e42a8347fa1a33a1e5bd082a6f0">
   <xsd:schema xmlns:xsd="http://www.w3.org/2001/XMLSchema" xmlns:xs="http://www.w3.org/2001/XMLSchema" xmlns:p="http://schemas.microsoft.com/office/2006/metadata/properties" xmlns:ns3="00f5eb7a-3f09-4ccb-9a17-2c4fa8202c3e" xmlns:ns4="534d57da-ff16-4cef-a6f3-6603b923fb9d" targetNamespace="http://schemas.microsoft.com/office/2006/metadata/properties" ma:root="true" ma:fieldsID="3152a6d693dc4f03211544ef130251e4" ns3:_="" ns4:_="">
     <xsd:import namespace="00f5eb7a-3f09-4ccb-9a17-2c4fa8202c3e"/>
@@ -24654,39 +24781,37 @@
 </ct:contentTypeSchema>
 </file>
 
+<file path=customXml/item3.xml><?xml version="1.0" encoding="utf-8"?>
+<b:Sources xmlns:b="http://schemas.openxmlformats.org/officeDocument/2006/bibliography" xmlns="http://schemas.openxmlformats.org/officeDocument/2006/bibliography" SelectedStyle="\APASixthEditionOfficeOnline.xsl" StyleName="APA" Version="6"/>
+</file>
+
+<file path=customXml/item4.xml><?xml version="1.0" encoding="utf-8"?>
+<?mso-contentType ?>
+<FormTemplates xmlns="http://schemas.microsoft.com/sharepoint/v3/contenttype/forms">
+  <Display>DocumentLibraryForm</Display>
+  <Edit>DocumentLibraryForm</Edit>
+  <New>DocumentLibraryForm</New>
+</FormTemplates>
+</file>
+
 <file path=customXml/item5.xml><?xml version="1.0" encoding="utf-8"?>
-<go:gDocsCustomXmlDataStorage xmlns:go="http://customooxmlschemas.google.com/" xmlns:r="http://schemas.openxmlformats.org/officeDocument/2006/relationships" uri="GoogleDocsCustomDataVersion2">
-  <go:docsCustomData xmlns:go="http://customooxmlschemas.google.com/" roundtripDataSignature="AMtx7mgdndu53wYGt6HnkXDpKDmMCu/43A==">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</go:docsCustomData>
-</go:gDocsCustomXmlDataStorage>
+<p:properties xmlns:p="http://schemas.microsoft.com/office/2006/metadata/properties" xmlns:xsi="http://www.w3.org/2001/XMLSchema-instance" xmlns:pc="http://schemas.microsoft.com/office/infopath/2007/PartnerControls">
+  <documentManagement>
+    <_activity xmlns="00f5eb7a-3f09-4ccb-9a17-2c4fa8202c3e" xsi:nil="true"/>
+  </documentManagement>
+</p:properties>
 </file>
 
 <file path=customXml/itemProps1.xml><?xml version="1.0" encoding="utf-8"?>
-<ds:datastoreItem xmlns:ds="http://schemas.openxmlformats.org/officeDocument/2006/customXml" ds:itemID="{9C00E788-F0BC-46FB-A07D-C58627BA0AFE}">
+<ds:datastoreItem xmlns:ds="http://schemas.openxmlformats.org/officeDocument/2006/customXml" ds:itemID="{11111111-1234-1234-1234-123412341234}">
   <ds:schemaRefs>
-    <ds:schemaRef ds:uri="http://schemas.microsoft.com/office/2006/metadata/properties"/>
-    <ds:schemaRef ds:uri="http://schemas.microsoft.com/office/infopath/2007/PartnerControls"/>
-    <ds:schemaRef ds:uri="00f5eb7a-3f09-4ccb-9a17-2c4fa8202c3e"/>
+    <ds:schemaRef ds:uri="http://customooxmlschemas.google.com/"/>
+    <ds:schemaRef ds:uri="http://schemas.openxmlformats.org/officeDocument/2006/relationships"/>
   </ds:schemaRefs>
 </ds:datastoreItem>
 </file>
 
 <file path=customXml/itemProps2.xml><?xml version="1.0" encoding="utf-8"?>
-<ds:datastoreItem xmlns:ds="http://schemas.openxmlformats.org/officeDocument/2006/customXml" ds:itemID="{337A23CE-E10A-4043-BC60-ADD821B08A35}">
-  <ds:schemaRefs>
-    <ds:schemaRef ds:uri="http://schemas.microsoft.com/sharepoint/v3/contenttype/forms"/>
-  </ds:schemaRefs>
-</ds:datastoreItem>
-</file>
-
-<file path=customXml/itemProps3.xml><?xml version="1.0" encoding="utf-8"?>
-<ds:datastoreItem xmlns:ds="http://schemas.openxmlformats.org/officeDocument/2006/customXml" ds:itemID="{DF6F51F4-5859-44B7-B20A-7EB4E4161878}">
-  <ds:schemaRefs>
-    <ds:schemaRef ds:uri="http://schemas.openxmlformats.org/officeDocument/2006/bibliography"/>
-  </ds:schemaRefs>
-</ds:datastoreItem>
-</file>
-
-<file path=customXml/itemProps4.xml><?xml version="1.0" encoding="utf-8"?>
 <ds:datastoreItem xmlns:ds="http://schemas.openxmlformats.org/officeDocument/2006/customXml" ds:itemID="{84C8490E-D3BA-4C03-B8F3-1DA315608BFD}">
   <ds:schemaRefs>
     <ds:schemaRef ds:uri="http://schemas.microsoft.com/office/2006/metadata/contentType"/>
@@ -24705,11 +24830,28 @@
 </ds:datastoreItem>
 </file>
 
+<file path=customXml/itemProps3.xml><?xml version="1.0" encoding="utf-8"?>
+<ds:datastoreItem xmlns:ds="http://schemas.openxmlformats.org/officeDocument/2006/customXml" ds:itemID="{DF6F51F4-5859-44B7-B20A-7EB4E4161878}">
+  <ds:schemaRefs>
+    <ds:schemaRef ds:uri="http://schemas.openxmlformats.org/officeDocument/2006/bibliography"/>
+  </ds:schemaRefs>
+</ds:datastoreItem>
+</file>
+
+<file path=customXml/itemProps4.xml><?xml version="1.0" encoding="utf-8"?>
+<ds:datastoreItem xmlns:ds="http://schemas.openxmlformats.org/officeDocument/2006/customXml" ds:itemID="{337A23CE-E10A-4043-BC60-ADD821B08A35}">
+  <ds:schemaRefs>
+    <ds:schemaRef ds:uri="http://schemas.microsoft.com/sharepoint/v3/contenttype/forms"/>
+  </ds:schemaRefs>
+</ds:datastoreItem>
+</file>
+
 <file path=customXml/itemProps5.xml><?xml version="1.0" encoding="utf-8"?>
-<ds:datastoreItem xmlns:ds="http://schemas.openxmlformats.org/officeDocument/2006/customXml" ds:itemID="{11111111-1234-1234-1234-123412341234}">
+<ds:datastoreItem xmlns:ds="http://schemas.openxmlformats.org/officeDocument/2006/customXml" ds:itemID="{9C00E788-F0BC-46FB-A07D-C58627BA0AFE}">
   <ds:schemaRefs>
-    <ds:schemaRef ds:uri="http://customooxmlschemas.google.com/"/>
-    <ds:schemaRef ds:uri="http://schemas.openxmlformats.org/officeDocument/2006/relationships"/>
+    <ds:schemaRef ds:uri="http://schemas.microsoft.com/office/2006/metadata/properties"/>
+    <ds:schemaRef ds:uri="http://schemas.microsoft.com/office/infopath/2007/PartnerControls"/>
+    <ds:schemaRef ds:uri="00f5eb7a-3f09-4ccb-9a17-2c4fa8202c3e"/>
   </ds:schemaRefs>
 </ds:datastoreItem>
 </file>
</xml_diff>